<commit_message>
Added project log - practical phase begins 13 March 2026
</commit_message>
<xml_diff>
--- a/09_reports/Interim_Progress_Report.docx
+++ b/09_reports/Interim_Progress_Report.docx
@@ -3044,7 +3044,10 @@
     </w:p>
     <w:p>
       <w:r>
-        <w:t xml:space="preserve">Other papers I’ve studied are in the following Bibliography </w:t>
+        <w:t>The following sources were also reviewed and helped inform the broader context of this project.</w:t>
+      </w:r>
+      <w:r>
+        <w:t xml:space="preserve"> </w:t>
       </w:r>
       <w:r>
         <w:fldChar w:fldCharType="begin"/>

</xml_diff>